<commit_message>
feat: Add history tracking and trends visualization
- Implemented HistoryStore for local SQLite storage of predictions.
- Created HistoryItem and HistoryBucket models for managing prediction data.
- Added DeviceId class for generating and storing a unique device identifier.
- Developed HistoryTrendsView for displaying trends in prediction data using fl_chart.
- Updated pubspec.yaml to include new dependencies: sqflite, fl_chart, uuid, and equatable.
- Enhanced pubspec.lock with new package versions and dependencies.
</commit_message>
<xml_diff>
--- a/HuskTech_Documentation.docx
+++ b/HuskTech_Documentation.docx
@@ -75,7 +75,7 @@
           <w:sz w:val="20"/>
           <w:szCs w:val="20"/>
         </w:rPr>
-        <w:t>Prepared: August 26, 2026</w:t>
+        <w:t>Prepared: September 16, 2026</w:t>
       </w:r>
     </w:p>
     <w:p>
@@ -143,9 +143,28 @@
         <w:alias w:val="Table of Contents"/>
       </w:sdtPr>
       <w:sdtContent>
-        <w:p/>
         <w:p>
-          <w:r/>
+          <w:r>
+            <w:fldChar w:fldCharType="begin" w:dirty="true"/>
+          </w:r>
+          <w:r>
+            <w:instrText xml:space="preserve"> TOC \o "1-3" \h \z \u </w:instrText>
+          </w:r>
+          <w:r>
+            <w:fldChar w:fldCharType="separate"/>
+          </w:r>
+          <w:r>
+            <w:rPr>
+              <w:rFonts w:ascii="Arial" w:hAnsi="Arial" w:eastAsia="Arial" w:cs="Arial"/>
+              <w:color w:val="202020"/>
+              <w:sz w:val="22"/>
+              <w:szCs w:val="22"/>
+            </w:rPr>
+            <w:t>Right-click here and choose Update Field if this table is not yet filled in.</w:t>
+          </w:r>
+          <w:r>
+            <w:fldChar w:fldCharType="end"/>
+          </w:r>
         </w:p>
       </w:sdtContent>
     </w:sdt>
@@ -972,32 +991,16 @@
           <w:sz w:val="22"/>
           <w:szCs w:val="22"/>
         </w:rPr>
-        <w:t xml:space="preserve">History with full classification breakdown: </w:t>
-      </w:r>
-      <w:r>
-        <w:rPr>
-          <w:rFonts w:ascii="Arial" w:hAnsi="Arial" w:eastAsia="Arial" w:cs="Arial"/>
-          <w:color w:val="202020"/>
-          <w:sz w:val="22"/>
-          <w:szCs w:val="22"/>
-        </w:rPr>
-        <w:t>every prediction is saved with its photo and timestamp; tapping an entry shows every class’s probability (not just the winner) and, when rejected, plain-language reasoning for why.</w:t>
-      </w:r>
-    </w:p>
-    <w:p>
-      <w:pPr>
-        <w:pStyle w:val="Heading2"/>
-      </w:pPr>
-      <w:r>
-        <w:rPr>
-          <w:rFonts w:ascii="Arial" w:hAnsi="Arial" w:eastAsia="Arial" w:cs="Arial"/>
-          <w:b/>
-          <w:bCs/>
-          <w:color w:val="1A1A1A"/>
-          <w:sz w:val="26"/>
-          <w:szCs w:val="26"/>
-        </w:rPr>
-        <w:t>2.5 Everything else</w:t>
+        <w:t xml:space="preserve">Persistent history: </w:t>
+      </w:r>
+      <w:r>
+        <w:rPr>
+          <w:rFonts w:ascii="Arial" w:hAnsi="Arial" w:eastAsia="Arial" w:cs="Arial"/>
+          <w:color w:val="202020"/>
+          <w:sz w:val="22"/>
+          <w:szCs w:val="22"/>
+        </w:rPr>
+        <w:t xml:space="preserve">every prediction (single photo, batch, or live-camera capture) is saved with its photo and timestamp to a local SQLite database on the device, so history survives app restarts. See Section 5.</w:t>
       </w:r>
     </w:p>
     <w:p>
@@ -1013,11 +1016,22 @@
       <w:r>
         <w:rPr>
           <w:rFonts w:ascii="Arial" w:hAnsi="Arial" w:eastAsia="Arial" w:cs="Arial"/>
-          <w:color w:val="202020"/>
-          <w:sz w:val="22"/>
-          <w:szCs w:val="22"/>
-        </w:rPr>
-        <w:t>In-app Custom Model Guide explaining the exact input/output contract a custom model must satisfy, with common pitfalls.</w:t>
+          <w:b/>
+          <w:bCs/>
+          <w:color w:val="202020"/>
+          <w:sz w:val="22"/>
+          <w:szCs w:val="22"/>
+        </w:rPr>
+        <w:t xml:space="preserve">Trends chart: </w:t>
+      </w:r>
+      <w:r>
+        <w:rPr>
+          <w:rFonts w:ascii="Arial" w:hAnsi="Arial" w:eastAsia="Arial" w:cs="Arial"/>
+          <w:color w:val="202020"/>
+          <w:sz w:val="22"/>
+          <w:szCs w:val="22"/>
+        </w:rPr>
+        <w:t xml:space="preserve">a second tab on the History page plots how many of each stage were scanned over time as a line graph, one color per class, filterable by Day (default), Week, Month, or Year, with per-class totals for the selected range underneath.</w:t>
       </w:r>
     </w:p>
     <w:p>
@@ -1033,11 +1047,38 @@
       <w:r>
         <w:rPr>
           <w:rFonts w:ascii="Arial" w:hAnsi="Arial" w:eastAsia="Arial" w:cs="Arial"/>
-          <w:color w:val="202020"/>
-          <w:sz w:val="22"/>
-          <w:szCs w:val="22"/>
-        </w:rPr>
-        <w:t>Structured logging viewable in-app (menu → View Logs).</w:t>
+          <w:b/>
+          <w:bCs/>
+          <w:color w:val="202020"/>
+          <w:sz w:val="22"/>
+          <w:szCs w:val="22"/>
+        </w:rPr>
+        <w:t xml:space="preserve">Full classification breakdown: </w:t>
+      </w:r>
+      <w:r>
+        <w:rPr>
+          <w:rFonts w:ascii="Arial" w:hAnsi="Arial" w:eastAsia="Arial" w:cs="Arial"/>
+          <w:color w:val="202020"/>
+          <w:sz w:val="22"/>
+          <w:szCs w:val="22"/>
+        </w:rPr>
+        <w:t xml:space="preserve">tapping a history entry shows every class’s probability (not just the winner) and, when rejected, plain-language reasoning for why.</w:t>
+      </w:r>
+    </w:p>
+    <w:p>
+      <w:pPr>
+        <w:pStyle w:val="Heading2"/>
+      </w:pPr>
+      <w:r>
+        <w:rPr>
+          <w:rFonts w:ascii="Arial" w:hAnsi="Arial" w:eastAsia="Arial" w:cs="Arial"/>
+          <w:b/>
+          <w:bCs/>
+          <w:color w:val="1A1A1A"/>
+          <w:sz w:val="26"/>
+          <w:szCs w:val="26"/>
+        </w:rPr>
+        <w:t>2.5 Everything else</w:t>
       </w:r>
     </w:p>
     <w:p>
@@ -1057,7 +1098,7 @@
           <w:sz w:val="22"/>
           <w:szCs w:val="22"/>
         </w:rPr>
-        <w:t>Light / dark theme toggle.</w:t>
+        <w:t>In-app Custom Model Guide explaining the exact input/output contract a custom model must satisfy, with common pitfalls.</w:t>
       </w:r>
     </w:p>
     <w:p>
@@ -1077,7 +1118,7 @@
           <w:sz w:val="22"/>
           <w:szCs w:val="22"/>
         </w:rPr>
-        <w:t>Information, User Manual, and About content, each laid out as individually boxed cards.</w:t>
+        <w:t>Structured logging viewable in-app (menu → View Logs).</w:t>
       </w:r>
     </w:p>
     <w:p>
@@ -1097,7 +1138,47 @@
           <w:sz w:val="22"/>
           <w:szCs w:val="22"/>
         </w:rPr>
-        <w:t>Custom app icon (generated from source artwork for both Android and Windows, with a purpose-built script fixing a Windows icon-scaling defect, see Section 6.4).</w:t>
+        <w:t>Light / dark theme toggle.</w:t>
+      </w:r>
+    </w:p>
+    <w:p>
+      <w:pPr>
+        <w:pStyle w:val="ListParagraph"/>
+        <w:numPr>
+          <w:ilvl w:val="0"/>
+          <w:numId w:val="2"/>
+        </w:numPr>
+        <w:spacing w:after="80"/>
+        <w:ind w:left="720" w:hanging="360"/>
+      </w:pPr>
+      <w:r>
+        <w:rPr>
+          <w:rFonts w:ascii="Arial" w:hAnsi="Arial" w:eastAsia="Arial" w:cs="Arial"/>
+          <w:color w:val="202020"/>
+          <w:sz w:val="22"/>
+          <w:szCs w:val="22"/>
+        </w:rPr>
+        <w:t>Information, User Manual, and About content, each laid out as individually boxed cards.</w:t>
+      </w:r>
+    </w:p>
+    <w:p>
+      <w:pPr>
+        <w:pStyle w:val="ListParagraph"/>
+        <w:numPr>
+          <w:ilvl w:val="0"/>
+          <w:numId w:val="2"/>
+        </w:numPr>
+        <w:spacing w:after="80"/>
+        <w:ind w:left="720" w:hanging="360"/>
+      </w:pPr>
+      <w:r>
+        <w:rPr>
+          <w:rFonts w:ascii="Arial" w:hAnsi="Arial" w:eastAsia="Arial" w:cs="Arial"/>
+          <w:color w:val="202020"/>
+          <w:sz w:val="22"/>
+          <w:szCs w:val="22"/>
+        </w:rPr>
+        <w:t>Custom app icon (generated from source artwork for both Android and Windows, with a purpose-built script fixing a Windows icon-scaling defect, see Section 7.4).</w:t>
       </w:r>
     </w:p>
     <w:p>
@@ -2242,7 +2323,444 @@
           <w:sz w:val="32"/>
           <w:szCs w:val="32"/>
         </w:rPr>
-        <w:t>5. Architecture &amp; Project Layout</w:t>
+        <w:t xml:space="preserve">5. Local Data Storage</w:t>
+      </w:r>
+    </w:p>
+    <w:p>
+      <w:pPr>
+        <w:spacing w:after="160"/>
+      </w:pPr>
+      <w:r>
+        <w:rPr>
+          <w:rFonts w:ascii="Arial" w:hAnsi="Arial" w:eastAsia="Arial" w:cs="Arial"/>
+          <w:color w:val="202020"/>
+          <w:sz w:val="22"/>
+          <w:szCs w:val="22"/>
+        </w:rPr>
+        <w:t xml:space="preserve">Prediction history lives in a local SQLite database on the device (husktech_history.db in the app’s documents directory), managed by lib/history_store.dart. This is the app’s only database. There is no centralized database, no server, and no sync: history never leaves the device, and each device holds only its own data. The only network requests the app makes are the plain GETs for model files described in Section 4.</w:t>
+      </w:r>
+    </w:p>
+    <w:p>
+      <w:pPr>
+        <w:pStyle w:val="Heading2"/>
+      </w:pPr>
+      <w:r>
+        <w:rPr>
+          <w:rFonts w:ascii="Arial" w:hAnsi="Arial" w:eastAsia="Arial" w:cs="Arial"/>
+          <w:b/>
+          <w:bCs/>
+          <w:color w:val="1A1A1A"/>
+          <w:sz w:val="26"/>
+          <w:szCs w:val="26"/>
+        </w:rPr>
+        <w:t xml:space="preserve">5.1 Schema</w:t>
+      </w:r>
+    </w:p>
+    <w:p>
+      <w:pPr>
+        <w:spacing w:after="160"/>
+      </w:pPr>
+      <w:r>
+        <w:rPr>
+          <w:rFonts w:ascii="Arial" w:hAnsi="Arial" w:eastAsia="Arial" w:cs="Arial"/>
+          <w:color w:val="202020"/>
+          <w:sz w:val="22"/>
+          <w:szCs w:val="22"/>
+        </w:rPr>
+        <w:t xml:space="preserve">One table, predictions, indexed on timestamp_ms. Each row stores enough to rebuild the full result shown in History: predicted_class, raw_predicted_class (before the rejection layer), confidence, margin, explanation, use_cases, rejection_reason, the full class_probabilities vector (as JSON), image_path, the timestamp, and device_id.</w:t>
+      </w:r>
+    </w:p>
+    <w:p>
+      <w:pPr>
+        <w:pStyle w:val="Heading2"/>
+      </w:pPr>
+      <w:r>
+        <w:rPr>
+          <w:rFonts w:ascii="Arial" w:hAnsi="Arial" w:eastAsia="Arial" w:cs="Arial"/>
+          <w:b/>
+          <w:bCs/>
+          <w:color w:val="1A1A1A"/>
+          <w:sz w:val="26"/>
+          <w:szCs w:val="26"/>
+        </w:rPr>
+        <w:t xml:space="preserve">5.2 Device ID</w:t>
+      </w:r>
+    </w:p>
+    <w:p>
+      <w:pPr>
+        <w:pStyle w:val="ListParagraph"/>
+        <w:numPr>
+          <w:ilvl w:val="0"/>
+          <w:numId w:val="2"/>
+        </w:numPr>
+        <w:spacing w:after="80"/>
+        <w:ind w:left="720" w:hanging="360"/>
+      </w:pPr>
+      <w:r>
+        <w:rPr>
+          <w:rFonts w:ascii="Arial" w:hAnsi="Arial" w:eastAsia="Arial" w:cs="Arial"/>
+          <w:b/>
+          <w:bCs/>
+          <w:color w:val="202020"/>
+          <w:sz w:val="22"/>
+          <w:szCs w:val="22"/>
+        </w:rPr>
+        <w:t xml:space="preserve">What it is: </w:t>
+      </w:r>
+      <w:r>
+        <w:rPr>
+          <w:rFonts w:ascii="Arial" w:hAnsi="Arial" w:eastAsia="Arial" w:cs="Arial"/>
+          <w:color w:val="202020"/>
+          <w:sz w:val="22"/>
+          <w:szCs w:val="22"/>
+        </w:rPr>
+        <w:t xml:space="preserve">a random UUID v4 generated once on first launch and stored in SharedPreferences, then stamped on every saved row. It is shown low-key at the bottom of the About dialog so a tester can say which phone a given screenshot or report came from.</w:t>
+      </w:r>
+    </w:p>
+    <w:p>
+      <w:pPr>
+        <w:pStyle w:val="ListParagraph"/>
+        <w:numPr>
+          <w:ilvl w:val="0"/>
+          <w:numId w:val="2"/>
+        </w:numPr>
+        <w:spacing w:after="80"/>
+        <w:ind w:left="720" w:hanging="360"/>
+      </w:pPr>
+      <w:r>
+        <w:rPr>
+          <w:rFonts w:ascii="Arial" w:hAnsi="Arial" w:eastAsia="Arial" w:cs="Arial"/>
+          <w:b/>
+          <w:bCs/>
+          <w:color w:val="202020"/>
+          <w:sz w:val="22"/>
+          <w:szCs w:val="22"/>
+        </w:rPr>
+        <w:t xml:space="preserve">What it enforces: </w:t>
+      </w:r>
+      <w:r>
+        <w:rPr>
+          <w:rFonts w:ascii="Arial" w:hAnsi="Arial" w:eastAsia="Arial" w:cs="Arial"/>
+          <w:color w:val="202020"/>
+          <w:sz w:val="22"/>
+          <w:szCs w:val="22"/>
+        </w:rPr>
+        <w:t xml:space="preserve">every read in HistoryStore filters by this device’s own id, so “only this device’s data” is an explicit rule in code rather than an assumption.</w:t>
+      </w:r>
+    </w:p>
+    <w:p>
+      <w:pPr>
+        <w:pStyle w:val="ListParagraph"/>
+        <w:numPr>
+          <w:ilvl w:val="0"/>
+          <w:numId w:val="2"/>
+        </w:numPr>
+        <w:spacing w:after="80"/>
+        <w:ind w:left="720" w:hanging="360"/>
+      </w:pPr>
+      <w:r>
+        <w:rPr>
+          <w:rFonts w:ascii="Arial" w:hAnsi="Arial" w:eastAsia="Arial" w:cs="Arial"/>
+          <w:b/>
+          <w:bCs/>
+          <w:color w:val="202020"/>
+          <w:sz w:val="22"/>
+          <w:szCs w:val="22"/>
+        </w:rPr>
+        <w:t xml:space="preserve">What it is not: </w:t>
+      </w:r>
+      <w:r>
+        <w:rPr>
+          <w:rFonts w:ascii="Arial" w:hAnsi="Arial" w:eastAsia="Arial" w:cs="Arial"/>
+          <w:color w:val="202020"/>
+          <w:sz w:val="22"/>
+          <w:szCs w:val="22"/>
+        </w:rPr>
+        <w:t xml:space="preserve">it is not derived from any hardware identifier (Android ID, IMEI). Those need extra permissions and are more privacy-sensitive than this feature needs; a locally-generated random id is enough because it never leaves the device.</w:t>
+      </w:r>
+    </w:p>
+    <w:p>
+      <w:pPr>
+        <w:pStyle w:val="Heading2"/>
+      </w:pPr>
+      <w:r>
+        <w:rPr>
+          <w:rFonts w:ascii="Arial" w:hAnsi="Arial" w:eastAsia="Arial" w:cs="Arial"/>
+          <w:b/>
+          <w:bCs/>
+          <w:color w:val="1A1A1A"/>
+          <w:sz w:val="26"/>
+          <w:szCs w:val="26"/>
+        </w:rPr>
+        <w:t xml:space="preserve">5.3 Trends aggregation</w:t>
+      </w:r>
+    </w:p>
+    <w:p>
+      <w:pPr>
+        <w:spacing w:after="160"/>
+      </w:pPr>
+      <w:r>
+        <w:rPr>
+          <w:rFonts w:ascii="Arial" w:hAnsi="Arial" w:eastAsia="Arial" w:cs="Arial"/>
+          <w:color w:val="202020"/>
+          <w:sz w:val="22"/>
+          <w:szCs w:val="22"/>
+        </w:rPr>
+        <w:t xml:space="preserve">HistoryStore.aggregate buckets this device’s rows by the selected range and counts each class per bucket. Empty buckets are always returned too, so the chart’s x-axis stays stable even with sparse data.</w:t>
+      </w:r>
+    </w:p>
+    <w:p>
+      <w:pPr>
+        <w:pStyle w:val="ListParagraph"/>
+        <w:numPr>
+          <w:ilvl w:val="0"/>
+          <w:numId w:val="2"/>
+        </w:numPr>
+        <w:spacing w:after="80"/>
+        <w:ind w:left="720" w:hanging="360"/>
+      </w:pPr>
+      <w:r>
+        <w:rPr>
+          <w:rFonts w:ascii="Arial" w:hAnsi="Arial" w:eastAsia="Arial" w:cs="Arial"/>
+          <w:b/>
+          <w:bCs/>
+          <w:color w:val="202020"/>
+          <w:sz w:val="22"/>
+          <w:szCs w:val="22"/>
+        </w:rPr>
+        <w:t xml:space="preserve">Day: </w:t>
+      </w:r>
+      <w:r>
+        <w:rPr>
+          <w:rFonts w:ascii="Arial" w:hAnsi="Arial" w:eastAsia="Arial" w:cs="Arial"/>
+          <w:color w:val="202020"/>
+          <w:sz w:val="22"/>
+          <w:szCs w:val="22"/>
+        </w:rPr>
+        <w:t xml:space="preserve">24 hourly buckets for the current calendar day.</w:t>
+      </w:r>
+    </w:p>
+    <w:p>
+      <w:pPr>
+        <w:pStyle w:val="ListParagraph"/>
+        <w:numPr>
+          <w:ilvl w:val="0"/>
+          <w:numId w:val="2"/>
+        </w:numPr>
+        <w:spacing w:after="80"/>
+        <w:ind w:left="720" w:hanging="360"/>
+      </w:pPr>
+      <w:r>
+        <w:rPr>
+          <w:rFonts w:ascii="Arial" w:hAnsi="Arial" w:eastAsia="Arial" w:cs="Arial"/>
+          <w:b/>
+          <w:bCs/>
+          <w:color w:val="202020"/>
+          <w:sz w:val="22"/>
+          <w:szCs w:val="22"/>
+        </w:rPr>
+        <w:t xml:space="preserve">Week: </w:t>
+      </w:r>
+      <w:r>
+        <w:rPr>
+          <w:rFonts w:ascii="Arial" w:hAnsi="Arial" w:eastAsia="Arial" w:cs="Arial"/>
+          <w:color w:val="202020"/>
+          <w:sz w:val="22"/>
+          <w:szCs w:val="22"/>
+        </w:rPr>
+        <w:t xml:space="preserve">one bucket per day, Monday through Sunday of the current week.</w:t>
+      </w:r>
+    </w:p>
+    <w:p>
+      <w:pPr>
+        <w:pStyle w:val="ListParagraph"/>
+        <w:numPr>
+          <w:ilvl w:val="0"/>
+          <w:numId w:val="2"/>
+        </w:numPr>
+        <w:spacing w:after="80"/>
+        <w:ind w:left="720" w:hanging="360"/>
+      </w:pPr>
+      <w:r>
+        <w:rPr>
+          <w:rFonts w:ascii="Arial" w:hAnsi="Arial" w:eastAsia="Arial" w:cs="Arial"/>
+          <w:b/>
+          <w:bCs/>
+          <w:color w:val="202020"/>
+          <w:sz w:val="22"/>
+          <w:szCs w:val="22"/>
+        </w:rPr>
+        <w:t xml:space="preserve">Month: </w:t>
+      </w:r>
+      <w:r>
+        <w:rPr>
+          <w:rFonts w:ascii="Arial" w:hAnsi="Arial" w:eastAsia="Arial" w:cs="Arial"/>
+          <w:color w:val="202020"/>
+          <w:sz w:val="22"/>
+          <w:szCs w:val="22"/>
+        </w:rPr>
+        <w:t xml:space="preserve">one bucket per day of the current calendar month.</w:t>
+      </w:r>
+    </w:p>
+    <w:p>
+      <w:pPr>
+        <w:pStyle w:val="ListParagraph"/>
+        <w:numPr>
+          <w:ilvl w:val="0"/>
+          <w:numId w:val="2"/>
+        </w:numPr>
+        <w:spacing w:after="80"/>
+        <w:ind w:left="720" w:hanging="360"/>
+      </w:pPr>
+      <w:r>
+        <w:rPr>
+          <w:rFonts w:ascii="Arial" w:hAnsi="Arial" w:eastAsia="Arial" w:cs="Arial"/>
+          <w:b/>
+          <w:bCs/>
+          <w:color w:val="202020"/>
+          <w:sz w:val="22"/>
+          <w:szCs w:val="22"/>
+        </w:rPr>
+        <w:t xml:space="preserve">Year: </w:t>
+      </w:r>
+      <w:r>
+        <w:rPr>
+          <w:rFonts w:ascii="Arial" w:hAnsi="Arial" w:eastAsia="Arial" w:cs="Arial"/>
+          <w:color w:val="202020"/>
+          <w:sz w:val="22"/>
+          <w:szCs w:val="22"/>
+        </w:rPr>
+        <w:t xml:space="preserve">one bucket per month of the current calendar year.</w:t>
+      </w:r>
+    </w:p>
+    <w:p>
+      <w:pPr>
+        <w:pStyle w:val="Heading2"/>
+      </w:pPr>
+      <w:r>
+        <w:rPr>
+          <w:rFonts w:ascii="Arial" w:hAnsi="Arial" w:eastAsia="Arial" w:cs="Arial"/>
+          <w:b/>
+          <w:bCs/>
+          <w:color w:val="1A1A1A"/>
+          <w:sz w:val="26"/>
+          <w:szCs w:val="26"/>
+        </w:rPr>
+        <w:t xml:space="preserve">5.4 Platform and failure handling</w:t>
+      </w:r>
+    </w:p>
+    <w:p>
+      <w:pPr>
+        <w:pStyle w:val="ListParagraph"/>
+        <w:numPr>
+          <w:ilvl w:val="0"/>
+          <w:numId w:val="2"/>
+        </w:numPr>
+        <w:spacing w:after="80"/>
+        <w:ind w:left="720" w:hanging="360"/>
+      </w:pPr>
+      <w:r>
+        <w:rPr>
+          <w:rFonts w:ascii="Arial" w:hAnsi="Arial" w:eastAsia="Arial" w:cs="Arial"/>
+          <w:b/>
+          <w:bCs/>
+          <w:color w:val="202020"/>
+          <w:sz w:val="22"/>
+          <w:szCs w:val="22"/>
+        </w:rPr>
+        <w:t xml:space="preserve">Android: </w:t>
+      </w:r>
+      <w:r>
+        <w:rPr>
+          <w:rFonts w:ascii="Arial" w:hAnsi="Arial" w:eastAsia="Arial" w:cs="Arial"/>
+          <w:color w:val="202020"/>
+          <w:sz w:val="22"/>
+          <w:szCs w:val="22"/>
+        </w:rPr>
+        <w:t xml:space="preserve">uses the sqflite plugin (the real target).</w:t>
+      </w:r>
+    </w:p>
+    <w:p>
+      <w:pPr>
+        <w:pStyle w:val="ListParagraph"/>
+        <w:numPr>
+          <w:ilvl w:val="0"/>
+          <w:numId w:val="2"/>
+        </w:numPr>
+        <w:spacing w:after="80"/>
+        <w:ind w:left="720" w:hanging="360"/>
+      </w:pPr>
+      <w:r>
+        <w:rPr>
+          <w:rFonts w:ascii="Arial" w:hAnsi="Arial" w:eastAsia="Arial" w:cs="Arial"/>
+          <w:b/>
+          <w:bCs/>
+          <w:color w:val="202020"/>
+          <w:sz w:val="22"/>
+          <w:szCs w:val="22"/>
+        </w:rPr>
+        <w:t xml:space="preserve">Windows (development only): </w:t>
+      </w:r>
+      <w:r>
+        <w:rPr>
+          <w:rFonts w:ascii="Arial" w:hAnsi="Arial" w:eastAsia="Arial" w:cs="Arial"/>
+          <w:color w:val="202020"/>
+          <w:sz w:val="22"/>
+          <w:szCs w:val="22"/>
+        </w:rPr>
+        <w:t xml:space="preserve">sqflite_common_ffi’s desktop backend is swapped in at runtime so the same code path works under flutter run -d windows.</w:t>
+      </w:r>
+    </w:p>
+    <w:p>
+      <w:pPr>
+        <w:pStyle w:val="ListParagraph"/>
+        <w:numPr>
+          <w:ilvl w:val="0"/>
+          <w:numId w:val="2"/>
+        </w:numPr>
+        <w:spacing w:after="80"/>
+        <w:ind w:left="720" w:hanging="360"/>
+      </w:pPr>
+      <w:r>
+        <w:rPr>
+          <w:rFonts w:ascii="Arial" w:hAnsi="Arial" w:eastAsia="Arial" w:cs="Arial"/>
+          <w:b/>
+          <w:bCs/>
+          <w:color w:val="202020"/>
+          <w:sz w:val="22"/>
+          <w:szCs w:val="22"/>
+        </w:rPr>
+        <w:t xml:space="preserve">Write failures: </w:t>
+      </w:r>
+      <w:r>
+        <w:rPr>
+          <w:rFonts w:ascii="Arial" w:hAnsi="Arial" w:eastAsia="Arial" w:cs="Arial"/>
+          <w:color w:val="202020"/>
+          <w:sz w:val="22"/>
+          <w:szCs w:val="22"/>
+        </w:rPr>
+        <w:t xml:space="preserve">a failed history write is logged (visible in View Logs) and never blocks or alters the classification result the user already has on screen.</w:t>
+      </w:r>
+    </w:p>
+    <w:p>
+      <w:pPr>
+        <w:spacing w:after="160"/>
+      </w:pPr>
+    </w:p>
+    <w:p>
+      <w:pPr>
+        <w:pStyle w:val="Heading1"/>
+      </w:pPr>
+      <w:r>
+        <w:rPr>
+          <w:rFonts w:ascii="Arial" w:hAnsi="Arial" w:eastAsia="Arial" w:cs="Arial"/>
+          <w:b/>
+          <w:bCs/>
+          <w:color w:val="00695C"/>
+          <w:sz w:val="32"/>
+          <w:szCs w:val="32"/>
+        </w:rPr>
+        <w:t>6. Architecture &amp; Project Layout</w:t>
       </w:r>
     </w:p>
     <w:tbl>
@@ -2716,6 +3234,126 @@
                 <w:sz w:val="19"/>
                 <w:szCs w:val="19"/>
               </w:rPr>
+              <w:t>lib/history_store.dart</w:t>
+            </w:r>
+          </w:p>
+        </w:tc>
+        <w:tc>
+          <w:tcPr>
+            <w:tcW w:w="4760" w:type="dxa"/>
+            <w:tcBorders>
+              <w:top w:val="single" w:sz="2" w:color="CCCCCC"/>
+              <w:left w:val="single" w:sz="2" w:color="CCCCCC"/>
+              <w:bottom w:val="single" w:sz="2" w:color="CCCCCC"/>
+              <w:right w:val="single" w:sz="2" w:color="CCCCCC"/>
+            </w:tcBorders>
+            <w:tcMar>
+              <w:top w:w="80" w:type="dxa"/>
+              <w:left w:w="120" w:type="dxa"/>
+              <w:bottom w:w="80" w:type="dxa"/>
+              <w:right w:w="120" w:type="dxa"/>
+            </w:tcMar>
+            <w:vAlign w:val="center"/>
+          </w:tcPr>
+          <w:p>
+            <w:r>
+              <w:rPr>
+                <w:rFonts w:ascii="Arial" w:hAnsi="Arial" w:eastAsia="Arial" w:cs="Arial"/>
+                <w:color w:val="202020"/>
+                <w:sz w:val="20"/>
+                <w:szCs w:val="20"/>
+              </w:rPr>
+              <w:t>Local SQLite history database + per-device id (no centralized counterpart)</w:t>
+            </w:r>
+          </w:p>
+        </w:tc>
+      </w:tr>
+      <w:tr>
+        <w:tc>
+          <w:tcPr>
+            <w:tcW w:w="4600" w:type="dxa"/>
+            <w:tcBorders>
+              <w:top w:val="single" w:sz="2" w:color="CCCCCC"/>
+              <w:left w:val="single" w:sz="2" w:color="CCCCCC"/>
+              <w:bottom w:val="single" w:sz="2" w:color="CCCCCC"/>
+              <w:right w:val="single" w:sz="2" w:color="CCCCCC"/>
+            </w:tcBorders>
+            <w:tcMar>
+              <w:top w:w="80" w:type="dxa"/>
+              <w:left w:w="120" w:type="dxa"/>
+              <w:bottom w:w="80" w:type="dxa"/>
+              <w:right w:w="120" w:type="dxa"/>
+            </w:tcMar>
+            <w:vAlign w:val="center"/>
+          </w:tcPr>
+          <w:p>
+            <w:r>
+              <w:rPr>
+                <w:rFonts w:ascii="Consolas" w:hAnsi="Consolas" w:eastAsia="Consolas" w:cs="Consolas"/>
+                <w:color w:val="202020"/>
+                <w:sz w:val="19"/>
+                <w:szCs w:val="19"/>
+              </w:rPr>
+              <w:t>lib/history_trends_view.dart</w:t>
+            </w:r>
+          </w:p>
+        </w:tc>
+        <w:tc>
+          <w:tcPr>
+            <w:tcW w:w="4760" w:type="dxa"/>
+            <w:tcBorders>
+              <w:top w:val="single" w:sz="2" w:color="CCCCCC"/>
+              <w:left w:val="single" w:sz="2" w:color="CCCCCC"/>
+              <w:bottom w:val="single" w:sz="2" w:color="CCCCCC"/>
+              <w:right w:val="single" w:sz="2" w:color="CCCCCC"/>
+            </w:tcBorders>
+            <w:tcMar>
+              <w:top w:w="80" w:type="dxa"/>
+              <w:left w:w="120" w:type="dxa"/>
+              <w:bottom w:w="80" w:type="dxa"/>
+              <w:right w:w="120" w:type="dxa"/>
+            </w:tcMar>
+            <w:vAlign w:val="center"/>
+          </w:tcPr>
+          <w:p>
+            <w:r>
+              <w:rPr>
+                <w:rFonts w:ascii="Arial" w:hAnsi="Arial" w:eastAsia="Arial" w:cs="Arial"/>
+                <w:color w:val="202020"/>
+                <w:sz w:val="20"/>
+                <w:szCs w:val="20"/>
+              </w:rPr>
+              <w:t>Day / Week / Month / Year trends chart and totals</w:t>
+            </w:r>
+          </w:p>
+        </w:tc>
+      </w:tr>
+      <w:tr>
+        <w:tc>
+          <w:tcPr>
+            <w:tcW w:w="4600" w:type="dxa"/>
+            <w:tcBorders>
+              <w:top w:val="single" w:sz="2" w:color="CCCCCC"/>
+              <w:left w:val="single" w:sz="2" w:color="CCCCCC"/>
+              <w:bottom w:val="single" w:sz="2" w:color="CCCCCC"/>
+              <w:right w:val="single" w:sz="2" w:color="CCCCCC"/>
+            </w:tcBorders>
+            <w:tcMar>
+              <w:top w:w="80" w:type="dxa"/>
+              <w:left w:w="120" w:type="dxa"/>
+              <w:bottom w:w="80" w:type="dxa"/>
+              <w:right w:w="120" w:type="dxa"/>
+            </w:tcMar>
+            <w:vAlign w:val="center"/>
+          </w:tcPr>
+          <w:p>
+            <w:r>
+              <w:rPr>
+                <w:rFonts w:ascii="Consolas" w:hAnsi="Consolas" w:eastAsia="Consolas" w:cs="Consolas"/>
+                <w:color w:val="202020"/>
+                <w:sz w:val="19"/>
+                <w:szCs w:val="19"/>
+              </w:rPr>
               <w:t>assets/model/coconut_husk_quality_model.tflite</w:t>
             </w:r>
           </w:p>
@@ -3088,7 +3726,7 @@
           <w:sz w:val="32"/>
           <w:szCs w:val="32"/>
         </w:rPr>
-        <w:t>6. Build &amp; Run</w:t>
+        <w:t>7. Build &amp; Run</w:t>
       </w:r>
     </w:p>
     <w:p>
@@ -3104,7 +3742,7 @@
           <w:sz w:val="26"/>
           <w:szCs w:val="26"/>
         </w:rPr>
-        <w:t>6.1 Setup</w:t>
+        <w:t>7.1 Setup</w:t>
       </w:r>
     </w:p>
     <w:p>
@@ -3194,7 +3832,7 @@
           <w:sz w:val="26"/>
           <w:szCs w:val="26"/>
         </w:rPr>
-        <w:t>6.2 Android (primary target)</w:t>
+        <w:t>7.2 Android (primary target)</w:t>
       </w:r>
     </w:p>
     <w:p>
@@ -3320,7 +3958,7 @@
           <w:sz w:val="26"/>
           <w:szCs w:val="26"/>
         </w:rPr>
-        <w:t>6.3 Windows (development)</w:t>
+        <w:t>7.3 Windows (development)</w:t>
       </w:r>
     </w:p>
     <w:p>
@@ -3446,7 +4084,7 @@
           <w:sz w:val="26"/>
           <w:szCs w:val="26"/>
         </w:rPr>
-        <w:t>6.4 App icon</w:t>
+        <w:t>7.4 App icon</w:t>
       </w:r>
     </w:p>
     <w:p>
@@ -3525,7 +4163,7 @@
           <w:sz w:val="32"/>
           <w:szCs w:val="32"/>
         </w:rPr>
-        <w:t>7. Troubleshooting</w:t>
+        <w:t>8. Troubleshooting</w:t>
       </w:r>
     </w:p>
     <w:tbl>
@@ -3848,7 +4486,7 @@
                 <w:sz w:val="20"/>
                 <w:szCs w:val="20"/>
               </w:rPr>
-              <w:t>A previous husktech.exe is very likely still running and holding the file, see Section 6.3.</w:t>
+              <w:t>A previous husktech.exe is very likely still running and holding the file, see Section 7.3.</w:t>
             </w:r>
           </w:p>
         </w:tc>

</xml_diff>